<commit_message>
updated demo 3 docx
</commit_message>
<xml_diff>
--- a/Demos/Tier 3/Demo 3 - Analysing and Visualising a Dataset.docx
+++ b/Demos/Tier 3/Demo 3 - Analysing and Visualising a Dataset.docx
@@ -19,6 +19,9 @@
     <w:p>
       <w:pPr>
         <w:spacing w:after="240" w:line="360" w:lineRule="auto"/>
+        <w:rPr>
+          <w:rFonts w:ascii="IBM Plex Sans" w:eastAsia="IBM Plex Sans" w:hAnsi="IBM Plex Sans"/>
+        </w:rPr>
       </w:pPr>
       <w:r>
         <w:rPr>
@@ -37,6 +40,18 @@
           <w:rFonts w:ascii="IBM Plex Sans" w:eastAsia="IBM Plex Sans" w:hAnsi="IBM Plex Sans"/>
         </w:rPr>
         <w:t>retail sales dataset included in the workspace. You will use IBM Bob to read and explain the data in plain English, create visual charts, and then plan (and optionally build) an interactive dashboard app. Just follow the steps below.</w:t>
+      </w:r>
+    </w:p>
+    <w:p>
+      <w:pPr>
+        <w:spacing w:after="240" w:line="360" w:lineRule="auto"/>
+      </w:pPr>
+      <w:r>
+        <w:rPr>
+          <w:i/>
+          <w:iCs/>
+        </w:rPr>
+        <w:t>There is also a completed version of this demo that can be viewed in Demo folder.</w:t>
       </w:r>
     </w:p>
     <w:p>
@@ -190,7 +205,19 @@
         <w:rPr>
           <w:rFonts w:ascii="IBM Plex Sans" w:eastAsia="IBM Plex Sans" w:hAnsi="IBM Plex Sans"/>
         </w:rPr>
-        <w:t>Type the following prompt into the Bob chat and press Enter:</w:t>
+        <w:t xml:space="preserve">Type the following prompt into the Bob chat </w:t>
+      </w:r>
+      <w:r>
+        <w:rPr>
+          <w:rFonts w:ascii="IBM Plex Sans" w:eastAsia="IBM Plex Sans" w:hAnsi="IBM Plex Sans"/>
+        </w:rPr>
+        <w:t xml:space="preserve">using ‘Ask’ mode </w:t>
+      </w:r>
+      <w:r>
+        <w:rPr>
+          <w:rFonts w:ascii="IBM Plex Sans" w:eastAsia="IBM Plex Sans" w:hAnsi="IBM Plex Sans"/>
+        </w:rPr>
+        <w:t>and press Enter:</w:t>
       </w:r>
     </w:p>
     <w:p>
@@ -224,14 +251,8 @@
         <w:rPr>
           <w:rFonts w:ascii="IBM Plex Sans" w:eastAsia="IBM Plex Sans" w:hAnsi="IBM Plex Sans"/>
         </w:rPr>
-        <w:t xml:space="preserve">Bob will read the file and return a plain-English summary covering the date range, product categories (Electronics, Clothing, Beauty), customer age groups, sales </w:t>
-      </w:r>
-      <w:r>
-        <w:rPr>
-          <w:rFonts w:ascii="IBM Plex Sans" w:eastAsia="IBM Plex Sans" w:hAnsi="IBM Plex Sans"/>
-        </w:rPr>
         <w:lastRenderedPageBreak/>
-        <w:t>totals, and any patterns it can identify. You do not need to understand the raw data yourself - Bob translates it into a business-readable narrative.</w:t>
+        <w:t>Bob will read the file and return a plain-English summary covering the date range, product categories (Electronics, Clothing, Beauty), customer age groups, sales totals, and any patterns it can identify. You do not need to understand the raw data yourself - Bob translates it into a business-readable narrative.</w:t>
       </w:r>
     </w:p>
     <w:p>
@@ -311,7 +332,19 @@
         <w:rPr>
           <w:rFonts w:ascii="IBM Plex Sans" w:eastAsia="IBM Plex Sans" w:hAnsi="IBM Plex Sans"/>
         </w:rPr>
-        <w:t>Now ask Bob to turn the data into visual charts directly in the chat. Use this prompt:</w:t>
+        <w:t>Now ask Bob to turn the data into visual charts directly in the chat. Use this prompt</w:t>
+      </w:r>
+      <w:r>
+        <w:rPr>
+          <w:rFonts w:ascii="IBM Plex Sans" w:eastAsia="IBM Plex Sans" w:hAnsi="IBM Plex Sans"/>
+        </w:rPr>
+        <w:t xml:space="preserve"> in ‘Agent’ mode</w:t>
+      </w:r>
+      <w:r>
+        <w:rPr>
+          <w:rFonts w:ascii="IBM Plex Sans" w:eastAsia="IBM Plex Sans" w:hAnsi="IBM Plex Sans"/>
+        </w:rPr>
+        <w:t>:</w:t>
       </w:r>
     </w:p>
     <w:p>
@@ -430,7 +463,19 @@
         <w:rPr>
           <w:rFonts w:ascii="IBM Plex Sans" w:eastAsia="IBM Plex Sans" w:hAnsi="IBM Plex Sans"/>
         </w:rPr>
-        <w:t>Ask Bob to design an app that would make this data accessible and useful for a business user. Switch Bob to Plan mode first (click the mode selector above the chat input), then use this prompt:</w:t>
+        <w:t>Ask Bob to design an app that would make this data accessible and useful for a business user. Switch Bob to Plan mode first (click the mode selector above the chat input), then use this prompt</w:t>
+      </w:r>
+      <w:r>
+        <w:rPr>
+          <w:rFonts w:ascii="IBM Plex Sans" w:eastAsia="IBM Plex Sans" w:hAnsi="IBM Plex Sans"/>
+        </w:rPr>
+        <w:t xml:space="preserve"> in the ‘Plan’ mode</w:t>
+      </w:r>
+      <w:r>
+        <w:rPr>
+          <w:rFonts w:ascii="IBM Plex Sans" w:eastAsia="IBM Plex Sans" w:hAnsi="IBM Plex Sans"/>
+        </w:rPr>
+        <w:t>:</w:t>
       </w:r>
     </w:p>
     <w:p>
@@ -466,7 +511,6 @@
           <w:rFonts w:ascii="IBM Plex Mono" w:eastAsia="Courier New" w:hAnsi="IBM Plex Mono"/>
           <w:color w:val="FFFFFF"/>
         </w:rPr>
-        <w:lastRenderedPageBreak/>
         <w:t>I want to turn this retail sales data into an interactive dashboard that a non-technical business user could use. Plan out what the application should look like, what features it should have, and how it should be built. Think about things like filters, charts, key metrics, and how users would navigate it.</w:t>
       </w:r>
     </w:p>
@@ -511,7 +555,19 @@
         <w:rPr>
           <w:rFonts w:ascii="IBM Plex Sans" w:eastAsia="IBM Plex Sans" w:hAnsi="IBM Plex Sans"/>
         </w:rPr>
-        <w:t>This optional section takes the plan from Step 6 and turns it into a real, working application. Switch Bob back to Agent mode, then use this prompt:</w:t>
+        <w:t>This optional section takes the plan from Step 6 and turns it into a real, working application. Switch Bob back to Agent mode, then use this prompt</w:t>
+      </w:r>
+      <w:r>
+        <w:rPr>
+          <w:rFonts w:ascii="IBM Plex Sans" w:eastAsia="IBM Plex Sans" w:hAnsi="IBM Plex Sans"/>
+        </w:rPr>
+        <w:t xml:space="preserve"> in the ‘Agent’ mode</w:t>
+      </w:r>
+      <w:r>
+        <w:rPr>
+          <w:rFonts w:ascii="IBM Plex Sans" w:eastAsia="IBM Plex Sans" w:hAnsi="IBM Plex Sans"/>
+        </w:rPr>
+        <w:t>:</w:t>
       </w:r>
     </w:p>
     <w:p>
@@ -579,18 +635,9 @@
         <w:rPr>
           <w:rFonts w:ascii="IBM Plex Sans" w:eastAsia="IBM Plex Sans" w:hAnsi="IBM Plex Sans"/>
         </w:rPr>
+        <w:lastRenderedPageBreak/>
         <w:t>There is no single correct outcome here - the goal is to see how quickly Bob can go from a dataset to a running product, and how easy it is to steer the result through natural conversation rather than code changes.</w:t>
       </w:r>
-    </w:p>
-    <w:p>
-      <w:pPr>
-        <w:spacing w:before="240" w:after="120"/>
-        <w:rPr>
-          <w:rFonts w:ascii="IBM Plex Sans" w:eastAsia="IBM Plex Sans" w:hAnsi="IBM Plex Sans"/>
-          <w:b/>
-          <w:sz w:val="32"/>
-        </w:rPr>
-      </w:pPr>
     </w:p>
     <w:p>
       <w:pPr>

</xml_diff>